<commit_message>
Modelled response reading levels analysed
</commit_message>
<xml_diff>
--- a/Units/English/English_Unit_3/English Unit 3 Plan.docx
+++ b/Units/English/English_Unit_3/English Unit 3 Plan.docx
@@ -9428,6 +9428,37 @@
                 <w:szCs w:val="24"/>
               </w:rPr>
             </w:pPr>
+            <w:r>
+              <w:rPr>
+                <w:sz w:val="24"/>
+                <w:szCs w:val="24"/>
+              </w:rPr>
+              <w:t>Hicks, Lucas</w:t>
+            </w:r>
+            <w:r>
+              <w:rPr>
+                <w:sz w:val="24"/>
+                <w:szCs w:val="24"/>
+              </w:rPr>
+              <w:t xml:space="preserve"> (ICP English Y2 Maths Y3)</w:t>
+            </w:r>
+          </w:p>
+          <w:p>
+            <w:pPr>
+              <w:jc w:val="center"/>
+              <w:rPr>
+                <w:sz w:val="24"/>
+                <w:szCs w:val="24"/>
+              </w:rPr>
+            </w:pPr>
+            <w:r>
+              <w:rPr>
+                <w:sz w:val="24"/>
+                <w:szCs w:val="24"/>
+                <w:highlight w:val="yellow"/>
+              </w:rPr>
+              <w:t>Hines, Patrick</w:t>
+            </w:r>
           </w:p>
         </w:tc>
         <w:tc>
@@ -9465,6 +9496,161 @@
                 <w:szCs w:val="24"/>
               </w:rPr>
             </w:pPr>
+            <w:r>
+              <w:rPr>
+                <w:sz w:val="24"/>
+                <w:szCs w:val="24"/>
+              </w:rPr>
+              <w:t>Fields, Kianni</w:t>
+            </w:r>
+          </w:p>
+          <w:p>
+            <w:pPr>
+              <w:jc w:val="center"/>
+              <w:rPr>
+                <w:sz w:val="24"/>
+                <w:szCs w:val="24"/>
+              </w:rPr>
+            </w:pPr>
+            <w:r>
+              <w:rPr>
+                <w:sz w:val="24"/>
+                <w:szCs w:val="24"/>
+                <w:highlight w:val="yellow"/>
+              </w:rPr>
+              <w:t>Fuller, Jordan</w:t>
+            </w:r>
+          </w:p>
+          <w:p>
+            <w:pPr>
+              <w:jc w:val="center"/>
+              <w:rPr>
+                <w:sz w:val="24"/>
+                <w:szCs w:val="24"/>
+              </w:rPr>
+            </w:pPr>
+            <w:r>
+              <w:rPr>
+                <w:sz w:val="24"/>
+                <w:szCs w:val="24"/>
+              </w:rPr>
+              <w:t>Hart, Savannah</w:t>
+            </w:r>
+          </w:p>
+          <w:p>
+            <w:pPr>
+              <w:jc w:val="center"/>
+              <w:rPr>
+                <w:sz w:val="24"/>
+                <w:szCs w:val="24"/>
+              </w:rPr>
+            </w:pPr>
+            <w:r>
+              <w:rPr>
+                <w:sz w:val="24"/>
+                <w:szCs w:val="24"/>
+              </w:rPr>
+              <w:t>Heck, Lucas</w:t>
+            </w:r>
+          </w:p>
+          <w:p>
+            <w:pPr>
+              <w:jc w:val="center"/>
+              <w:rPr>
+                <w:sz w:val="24"/>
+                <w:szCs w:val="24"/>
+              </w:rPr>
+            </w:pPr>
+            <w:r>
+              <w:rPr>
+                <w:sz w:val="24"/>
+                <w:szCs w:val="24"/>
+              </w:rPr>
+              <w:t>Herzam, Harry</w:t>
+            </w:r>
+          </w:p>
+          <w:p>
+            <w:pPr>
+              <w:jc w:val="center"/>
+              <w:rPr>
+                <w:sz w:val="24"/>
+                <w:szCs w:val="24"/>
+              </w:rPr>
+            </w:pPr>
+            <w:r>
+              <w:rPr>
+                <w:sz w:val="24"/>
+                <w:szCs w:val="24"/>
+                <w:highlight w:val="yellow"/>
+              </w:rPr>
+              <w:t>McDonagh Walsh, Daina</w:t>
+            </w:r>
+          </w:p>
+          <w:p>
+            <w:pPr>
+              <w:jc w:val="center"/>
+              <w:rPr>
+                <w:sz w:val="24"/>
+                <w:szCs w:val="24"/>
+              </w:rPr>
+            </w:pPr>
+            <w:r>
+              <w:rPr>
+                <w:sz w:val="24"/>
+                <w:szCs w:val="24"/>
+              </w:rPr>
+              <w:t>Nicholson, Willow</w:t>
+            </w:r>
+          </w:p>
+          <w:p>
+            <w:pPr>
+              <w:jc w:val="center"/>
+              <w:rPr>
+                <w:sz w:val="24"/>
+                <w:szCs w:val="24"/>
+              </w:rPr>
+            </w:pPr>
+            <w:r>
+              <w:rPr>
+                <w:sz w:val="24"/>
+                <w:szCs w:val="24"/>
+                <w:highlight w:val="yellow"/>
+              </w:rPr>
+              <w:t>Pickup, Freya</w:t>
+            </w:r>
+          </w:p>
+          <w:p>
+            <w:pPr>
+              <w:jc w:val="center"/>
+              <w:rPr>
+                <w:sz w:val="24"/>
+                <w:szCs w:val="24"/>
+              </w:rPr>
+            </w:pPr>
+            <w:r>
+              <w:rPr>
+                <w:sz w:val="24"/>
+                <w:szCs w:val="24"/>
+                <w:highlight w:val="yellow"/>
+              </w:rPr>
+              <w:t>Reedy, Maxwell</w:t>
+            </w:r>
+          </w:p>
+          <w:p>
+            <w:pPr>
+              <w:jc w:val="center"/>
+              <w:rPr>
+                <w:sz w:val="24"/>
+                <w:szCs w:val="24"/>
+              </w:rPr>
+            </w:pPr>
+            <w:r>
+              <w:rPr>
+                <w:sz w:val="24"/>
+                <w:szCs w:val="24"/>
+              </w:rPr>
+              <w:t>Wendt, Felicity</w:t>
+            </w:r>
           </w:p>
         </w:tc>
         <w:tc>
@@ -9502,6 +9688,110 @@
                 <w:szCs w:val="24"/>
               </w:rPr>
             </w:pPr>
+            <w:r>
+              <w:rPr>
+                <w:sz w:val="24"/>
+                <w:szCs w:val="24"/>
+              </w:rPr>
+              <w:t>Barton, Jack</w:t>
+            </w:r>
+          </w:p>
+          <w:p>
+            <w:pPr>
+              <w:jc w:val="center"/>
+              <w:rPr>
+                <w:sz w:val="24"/>
+                <w:szCs w:val="24"/>
+              </w:rPr>
+            </w:pPr>
+            <w:r>
+              <w:rPr>
+                <w:sz w:val="24"/>
+                <w:szCs w:val="24"/>
+              </w:rPr>
+              <w:t>Binnie, Jaycee</w:t>
+            </w:r>
+          </w:p>
+          <w:p>
+            <w:pPr>
+              <w:jc w:val="center"/>
+              <w:rPr>
+                <w:sz w:val="24"/>
+                <w:szCs w:val="24"/>
+              </w:rPr>
+            </w:pPr>
+            <w:r>
+              <w:rPr>
+                <w:sz w:val="24"/>
+                <w:szCs w:val="24"/>
+                <w:highlight w:val="yellow"/>
+              </w:rPr>
+              <w:t>McDougall, Lakota</w:t>
+            </w:r>
+          </w:p>
+          <w:p>
+            <w:pPr>
+              <w:jc w:val="center"/>
+              <w:rPr>
+                <w:sz w:val="24"/>
+                <w:szCs w:val="24"/>
+              </w:rPr>
+            </w:pPr>
+            <w:r>
+              <w:rPr>
+                <w:sz w:val="24"/>
+                <w:szCs w:val="24"/>
+              </w:rPr>
+              <w:t>Morgan, Sommer</w:t>
+            </w:r>
+          </w:p>
+          <w:p>
+            <w:pPr>
+              <w:jc w:val="center"/>
+              <w:rPr>
+                <w:sz w:val="24"/>
+                <w:szCs w:val="24"/>
+              </w:rPr>
+            </w:pPr>
+            <w:r>
+              <w:rPr>
+                <w:sz w:val="24"/>
+                <w:szCs w:val="24"/>
+              </w:rPr>
+              <w:t>Pono, Carolyn</w:t>
+            </w:r>
+          </w:p>
+          <w:p>
+            <w:pPr>
+              <w:jc w:val="center"/>
+              <w:rPr>
+                <w:sz w:val="24"/>
+                <w:szCs w:val="24"/>
+              </w:rPr>
+            </w:pPr>
+            <w:r>
+              <w:rPr>
+                <w:sz w:val="24"/>
+                <w:szCs w:val="24"/>
+              </w:rPr>
+              <w:t>Pryor, Elouise</w:t>
+            </w:r>
+          </w:p>
+          <w:p>
+            <w:pPr>
+              <w:jc w:val="center"/>
+              <w:rPr>
+                <w:sz w:val="24"/>
+                <w:szCs w:val="24"/>
+              </w:rPr>
+            </w:pPr>
+            <w:r>
+              <w:rPr>
+                <w:sz w:val="24"/>
+                <w:szCs w:val="24"/>
+              </w:rPr>
+              <w:t>Taylor, Jacey</w:t>
+            </w:r>
           </w:p>
         </w:tc>
       </w:tr>
@@ -18890,6 +19180,37 @@
 </file>
 
 <file path=customXml/item1.xml><?xml version="1.0" encoding="utf-8"?>
+<?mso-contentType ?>
+<FormTemplates xmlns="http://schemas.microsoft.com/sharepoint/v3/contenttype/forms">
+  <Display>DocumentLibraryForm</Display>
+  <Edit>DocumentLibraryForm</Edit>
+  <New>DocumentLibraryForm</New>
+</FormTemplates>
+</file>
+
+<file path=customXml/item2.xml><?xml version="1.0" encoding="utf-8"?>
+<p:properties xmlns:p="http://schemas.microsoft.com/office/2006/metadata/properties" xmlns:xsi="http://www.w3.org/2001/XMLSchema-instance" xmlns:pc="http://schemas.microsoft.com/office/infopath/2007/PartnerControls">
+  <documentManagement>
+    <SharedWithUsers xmlns="b478141e-1202-47ac-8f5c-97382752b83f">
+      <UserInfo>
+        <DisplayName/>
+        <AccountId xsi:nil="true"/>
+        <AccountType/>
+      </UserInfo>
+    </SharedWithUsers>
+    <TaxCatchAll xmlns="b478141e-1202-47ac-8f5c-97382752b83f" xsi:nil="true"/>
+    <lcf76f155ced4ddcb4097134ff3c332f xmlns="8f97a0a0-4809-426f-b6cf-517cf2206d64">
+      <Terms xmlns="http://schemas.microsoft.com/office/infopath/2007/PartnerControls"/>
+    </lcf76f155ced4ddcb4097134ff3c332f>
+  </documentManagement>
+</p:properties>
+</file>
+
+<file path=customXml/item3.xml><?xml version="1.0" encoding="utf-8"?>
+<b:Sources xmlns:b="http://schemas.openxmlformats.org/officeDocument/2006/bibliography" xmlns="http://schemas.openxmlformats.org/officeDocument/2006/bibliography" SelectedStyle="\APASixthEditionOfficeOnline.xsl" StyleName="APA" Version="6"/>
+</file>
+
+<file path=customXml/item4.xml><?xml version="1.0" encoding="utf-8"?>
 <ct:contentTypeSchema xmlns:ct="http://schemas.microsoft.com/office/2006/metadata/contentType" xmlns:ma="http://schemas.microsoft.com/office/2006/metadata/properties/metaAttributes" ct:_="" ma:_="" ma:contentTypeName="Document" ma:contentTypeID="0x0101008E99BB53D98B8247B7D293C2F733BD12" ma:contentTypeVersion="14" ma:contentTypeDescription="Create a new document." ma:contentTypeScope="" ma:versionID="2cc72ce69752b3fa3773390c46b086ef">
   <xsd:schema xmlns:xsd="http://www.w3.org/2001/XMLSchema" xmlns:xs="http://www.w3.org/2001/XMLSchema" xmlns:p="http://schemas.microsoft.com/office/2006/metadata/properties" xmlns:ns2="8f97a0a0-4809-426f-b6cf-517cf2206d64" xmlns:ns3="b478141e-1202-47ac-8f5c-97382752b83f" targetNamespace="http://schemas.microsoft.com/office/2006/metadata/properties" ma:root="true" ma:fieldsID="1a12196587017c9a8f50b36c17154465" ns2:_="" ns3:_="">
     <xsd:import namespace="8f97a0a0-4809-426f-b6cf-517cf2206d64"/>
@@ -19118,42 +19439,26 @@
 </ct:contentTypeSchema>
 </file>
 
-<file path=customXml/item2.xml><?xml version="1.0" encoding="utf-8"?>
-<b:Sources xmlns:b="http://schemas.openxmlformats.org/officeDocument/2006/bibliography" xmlns="http://schemas.openxmlformats.org/officeDocument/2006/bibliography" SelectedStyle="\APASixthEditionOfficeOnline.xsl" StyleName="APA" Version="6"/>
-</file>
-
-<file path=customXml/item3.xml><?xml version="1.0" encoding="utf-8"?>
-<p:properties xmlns:p="http://schemas.microsoft.com/office/2006/metadata/properties" xmlns:xsi="http://www.w3.org/2001/XMLSchema-instance" xmlns:pc="http://schemas.microsoft.com/office/infopath/2007/PartnerControls">
-  <documentManagement>
-    <SharedWithUsers xmlns="b478141e-1202-47ac-8f5c-97382752b83f">
-      <UserInfo>
-        <DisplayName/>
-        <AccountId xsi:nil="true"/>
-        <AccountType/>
-      </UserInfo>
-    </SharedWithUsers>
-    <TaxCatchAll xmlns="b478141e-1202-47ac-8f5c-97382752b83f" xsi:nil="true"/>
-    <lcf76f155ced4ddcb4097134ff3c332f xmlns="8f97a0a0-4809-426f-b6cf-517cf2206d64">
-      <Terms xmlns="http://schemas.microsoft.com/office/infopath/2007/PartnerControls"/>
-    </lcf76f155ced4ddcb4097134ff3c332f>
-  </documentManagement>
-</p:properties>
-</file>
-
-<file path=customXml/item4.xml><?xml version="1.0" encoding="utf-8"?>
-<?mso-contentType ?>
-<FormTemplates xmlns="http://schemas.microsoft.com/sharepoint/v3/contenttype/forms">
-  <Display>DocumentLibraryForm</Display>
-  <Edit>DocumentLibraryForm</Edit>
-  <New>DocumentLibraryForm</New>
-</FormTemplates>
-</file>
-
 <file path=customXml/itemProps1.xml><?xml version="1.0" encoding="utf-8"?>
-<ds:datastoreItem xmlns:ds="http://schemas.openxmlformats.org/officeDocument/2006/customXml" ds:itemID="{2CE86FB2-27B9-4165-AB81-989375A07D2B}"/>
+<ds:datastoreItem xmlns:ds="http://schemas.openxmlformats.org/officeDocument/2006/customXml" ds:itemID="{FB845523-2AAF-44D7-99B1-6B98192895E2}">
+  <ds:schemaRefs>
+    <ds:schemaRef ds:uri="http://schemas.microsoft.com/sharepoint/v3/contenttype/forms"/>
+  </ds:schemaRefs>
+</ds:datastoreItem>
 </file>
 
 <file path=customXml/itemProps2.xml><?xml version="1.0" encoding="utf-8"?>
+<ds:datastoreItem xmlns:ds="http://schemas.openxmlformats.org/officeDocument/2006/customXml" ds:itemID="{5BD0E82D-D876-4D99-9D1F-DF8FD78B71CC}">
+  <ds:schemaRefs>
+    <ds:schemaRef ds:uri="http://schemas.microsoft.com/office/2006/metadata/properties"/>
+    <ds:schemaRef ds:uri="http://schemas.microsoft.com/office/infopath/2007/PartnerControls"/>
+    <ds:schemaRef ds:uri="b478141e-1202-47ac-8f5c-97382752b83f"/>
+    <ds:schemaRef ds:uri="8f97a0a0-4809-426f-b6cf-517cf2206d64"/>
+  </ds:schemaRefs>
+</ds:datastoreItem>
+</file>
+
+<file path=customXml/itemProps3.xml><?xml version="1.0" encoding="utf-8"?>
 <ds:datastoreItem xmlns:ds="http://schemas.openxmlformats.org/officeDocument/2006/customXml" ds:itemID="{D392FBCB-7725-453D-BC43-2A3AF5321C48}">
   <ds:schemaRefs>
     <ds:schemaRef ds:uri="http://schemas.openxmlformats.org/officeDocument/2006/bibliography"/>
@@ -19161,21 +19466,21 @@
 </ds:datastoreItem>
 </file>
 
-<file path=customXml/itemProps3.xml><?xml version="1.0" encoding="utf-8"?>
-<ds:datastoreItem xmlns:ds="http://schemas.openxmlformats.org/officeDocument/2006/customXml" ds:itemID="{5BD0E82D-D876-4D99-9D1F-DF8FD78B71CC}">
+<file path=customXml/itemProps4.xml><?xml version="1.0" encoding="utf-8"?>
+<ds:datastoreItem xmlns:ds="http://schemas.openxmlformats.org/officeDocument/2006/customXml" ds:itemID="{2CE86FB2-27B9-4165-AB81-989375A07D2B}">
   <ds:schemaRefs>
+    <ds:schemaRef ds:uri="http://schemas.microsoft.com/office/2006/metadata/contentType"/>
+    <ds:schemaRef ds:uri="http://schemas.microsoft.com/office/2006/metadata/properties/metaAttributes"/>
+    <ds:schemaRef ds:uri="http://www.w3.org/2001/XMLSchema"/>
     <ds:schemaRef ds:uri="http://schemas.microsoft.com/office/2006/metadata/properties"/>
+    <ds:schemaRef ds:uri="8f97a0a0-4809-426f-b6cf-517cf2206d64"/>
+    <ds:schemaRef ds:uri="b478141e-1202-47ac-8f5c-97382752b83f"/>
+    <ds:schemaRef ds:uri="http://schemas.microsoft.com/office/2006/documentManagement/types"/>
     <ds:schemaRef ds:uri="http://schemas.microsoft.com/office/infopath/2007/PartnerControls"/>
-    <ds:schemaRef ds:uri="03575809-ce26-4e06-8475-4b4cbde71387"/>
-    <ds:schemaRef ds:uri="22373c65-ac94-414f-afb2-7c24030d9a1d"/>
-  </ds:schemaRefs>
-</ds:datastoreItem>
-</file>
-
-<file path=customXml/itemProps4.xml><?xml version="1.0" encoding="utf-8"?>
-<ds:datastoreItem xmlns:ds="http://schemas.openxmlformats.org/officeDocument/2006/customXml" ds:itemID="{FB845523-2AAF-44D7-99B1-6B98192895E2}">
-  <ds:schemaRefs>
-    <ds:schemaRef ds:uri="http://schemas.microsoft.com/sharepoint/v3/contenttype/forms"/>
+    <ds:schemaRef ds:uri="http://schemas.openxmlformats.org/package/2006/metadata/core-properties"/>
+    <ds:schemaRef ds:uri="http://purl.org/dc/elements/1.1/"/>
+    <ds:schemaRef ds:uri="http://purl.org/dc/terms/"/>
+    <ds:schemaRef ds:uri="http://schemas.microsoft.com/internal/obd"/>
   </ds:schemaRefs>
 </ds:datastoreItem>
 </file>
</xml_diff>